<commit_message>
FCT Création View ZombieType Details
Ajout de la view Details affichant le ZombieType et la liste des zombies associés.
</commit_message>
<xml_diff>
--- a/S02_Lab1_ViewModels_Instructions.docx
+++ b/S02_Lab1_ViewModels_Instructions.docx
@@ -6798,7 +6798,7 @@
       <w:hyperlink r:id="rId13" w:history="1">
         <w:r>
           <w:rPr>
-            <w:rStyle w:val="Lienhypertexte"/>
+            <w:rStyle w:val="Hyperlien"/>
           </w:rPr>
           <w:t>https://localhost:NNNN/zombie/create</w:t>
         </w:r>
@@ -15996,6 +15996,9 @@
         <w:ind w:left="708"/>
       </w:pPr>
       <w:r>
+        <w:rPr>
+          <w:noProof/>
+        </w:rPr>
         <w:drawing>
           <wp:inline distT="0" distB="0" distL="0" distR="0" wp14:anchorId="03D68B17" wp14:editId="01B54A9F">
             <wp:extent cx="6404610" cy="2320290"/>
@@ -16111,6 +16114,9 @@
         </w:numPr>
       </w:pPr>
       <w:r>
+        <w:rPr>
+          <w:noProof/>
+        </w:rPr>
         <w:lastRenderedPageBreak/>
         <w:drawing>
           <wp:inline distT="0" distB="0" distL="0" distR="0" wp14:anchorId="3EFBBBBB" wp14:editId="2FE5C0DD">
@@ -18931,6 +18937,9 @@
       </w:r>
       <w:r>
         <w:t>vous devriez avoir ceci :</w:t>
+      </w:r>
+      <w:r>
+        <w:t xml:space="preserve"> JE SUIS ICI</w:t>
       </w:r>
     </w:p>
     <w:p>
@@ -38206,7 +38215,7 @@
       <w:szCs w:val="21"/>
     </w:rPr>
   </w:style>
-  <w:style w:type="character" w:styleId="Lienhypertexte">
+  <w:style w:type="character" w:styleId="Hyperlien">
     <w:name w:val="Hyperlink"/>
     <w:basedOn w:val="Policepardfaut"/>
     <w:uiPriority w:val="99"/>
@@ -38326,7 +38335,7 @@
       </w:tblBorders>
     </w:tblPr>
   </w:style>
-  <w:style w:type="character" w:styleId="Lienhypertextesuivivisit">
+  <w:style w:type="character" w:styleId="Lienvisit">
     <w:name w:val="FollowedHyperlink"/>
     <w:basedOn w:val="Policepardfaut"/>
     <w:uiPriority w:val="99"/>
@@ -38652,10 +38661,6 @@
 </file>
 
 <file path=customXml/item1.xml><?xml version="1.0" encoding="utf-8"?>
-<b:Sources xmlns:b="http://schemas.openxmlformats.org/officeDocument/2006/bibliography" xmlns="http://schemas.openxmlformats.org/officeDocument/2006/bibliography" SelectedStyle="\APASixthEditionOfficeOnline.xsl" StyleName="APA" Version="6"/>
-</file>
-
-<file path=customXml/item2.xml><?xml version="1.0" encoding="utf-8"?>
 <ct:contentTypeSchema xmlns:ct="http://schemas.microsoft.com/office/2006/metadata/contentType" xmlns:ma="http://schemas.microsoft.com/office/2006/metadata/properties/metaAttributes" ct:_="" ma:_="" ma:contentTypeName="Document" ma:contentTypeID="0x010100354AEAE9FD62D747A26A546E5B1B5735" ma:contentTypeVersion="7" ma:contentTypeDescription="Crée un document." ma:contentTypeScope="" ma:versionID="43b763fe9aa20b7a2976a5e019d82dbf">
   <xsd:schema xmlns:xsd="http://www.w3.org/2001/XMLSchema" xmlns:xs="http://www.w3.org/2001/XMLSchema" xmlns:p="http://schemas.microsoft.com/office/2006/metadata/properties" xmlns:ns2="071933db-0376-4694-9786-b56cb37c4ec2" targetNamespace="http://schemas.microsoft.com/office/2006/metadata/properties" ma:root="true" ma:fieldsID="d5c90ae6c1ec6ed317c9f5feddaf7a33" ns2:_="">
     <xsd:import namespace="071933db-0376-4694-9786-b56cb37c4ec2"/>
@@ -38819,7 +38824,17 @@
 </ct:contentTypeSchema>
 </file>
 
+<file path=customXml/item2.xml><?xml version="1.0" encoding="utf-8"?>
+<b:Sources xmlns:b="http://schemas.openxmlformats.org/officeDocument/2006/bibliography" xmlns="http://schemas.openxmlformats.org/officeDocument/2006/bibliography" SelectedStyle="\APASixthEditionOfficeOnline.xsl" StyleName="APA" Version="6"/>
+</file>
+
 <file path=customXml/item3.xml><?xml version="1.0" encoding="utf-8"?>
+<p:properties xmlns:p="http://schemas.microsoft.com/office/2006/metadata/properties" xmlns:xsi="http://www.w3.org/2001/XMLSchema-instance" xmlns:pc="http://schemas.microsoft.com/office/infopath/2007/PartnerControls">
+  <documentManagement/>
+</p:properties>
+</file>
+
+<file path=customXml/item4.xml><?xml version="1.0" encoding="utf-8"?>
 <?mso-contentType ?>
 <FormTemplates xmlns="http://schemas.microsoft.com/sharepoint/v3/contenttype/forms">
   <Display>DocumentLibraryForm</Display>
@@ -38828,21 +38843,7 @@
 </FormTemplates>
 </file>
 
-<file path=customXml/item4.xml><?xml version="1.0" encoding="utf-8"?>
-<p:properties xmlns:p="http://schemas.microsoft.com/office/2006/metadata/properties" xmlns:xsi="http://www.w3.org/2001/XMLSchema-instance" xmlns:pc="http://schemas.microsoft.com/office/infopath/2007/PartnerControls">
-  <documentManagement/>
-</p:properties>
-</file>
-
 <file path=customXml/itemProps1.xml><?xml version="1.0" encoding="utf-8"?>
-<ds:datastoreItem xmlns:ds="http://schemas.openxmlformats.org/officeDocument/2006/customXml" ds:itemID="{BA5DC8B6-1F73-4844-8DA8-B484D55D7FC3}">
-  <ds:schemaRefs>
-    <ds:schemaRef ds:uri="http://schemas.openxmlformats.org/officeDocument/2006/bibliography"/>
-  </ds:schemaRefs>
-</ds:datastoreItem>
-</file>
-
-<file path=customXml/itemProps2.xml><?xml version="1.0" encoding="utf-8"?>
 <ds:datastoreItem xmlns:ds="http://schemas.openxmlformats.org/officeDocument/2006/customXml" ds:itemID="{5C3A06EC-DC03-4D65-AA15-C6B9D68C1ED0}">
   <ds:schemaRefs>
     <ds:schemaRef ds:uri="http://schemas.microsoft.com/office/2006/metadata/contentType"/>
@@ -38860,19 +38861,27 @@
 </ds:datastoreItem>
 </file>
 
-<file path=customXml/itemProps3.xml><?xml version="1.0" encoding="utf-8"?>
-<ds:datastoreItem xmlns:ds="http://schemas.openxmlformats.org/officeDocument/2006/customXml" ds:itemID="{F6194C16-5FE5-4670-BEC8-3D6DD9380312}">
+<file path=customXml/itemProps2.xml><?xml version="1.0" encoding="utf-8"?>
+<ds:datastoreItem xmlns:ds="http://schemas.openxmlformats.org/officeDocument/2006/customXml" ds:itemID="{BA5DC8B6-1F73-4844-8DA8-B484D55D7FC3}">
   <ds:schemaRefs>
-    <ds:schemaRef ds:uri="http://schemas.microsoft.com/sharepoint/v3/contenttype/forms"/>
+    <ds:schemaRef ds:uri="http://schemas.openxmlformats.org/officeDocument/2006/bibliography"/>
   </ds:schemaRefs>
 </ds:datastoreItem>
 </file>
 
-<file path=customXml/itemProps4.xml><?xml version="1.0" encoding="utf-8"?>
+<file path=customXml/itemProps3.xml><?xml version="1.0" encoding="utf-8"?>
 <ds:datastoreItem xmlns:ds="http://schemas.openxmlformats.org/officeDocument/2006/customXml" ds:itemID="{2C36E056-BA2C-4A1F-9580-242C9B36FE70}">
   <ds:schemaRefs>
     <ds:schemaRef ds:uri="http://schemas.microsoft.com/office/2006/metadata/properties"/>
     <ds:schemaRef ds:uri="http://schemas.microsoft.com/office/infopath/2007/PartnerControls"/>
   </ds:schemaRefs>
 </ds:datastoreItem>
+</file>
+
+<file path=customXml/itemProps4.xml><?xml version="1.0" encoding="utf-8"?>
+<ds:datastoreItem xmlns:ds="http://schemas.openxmlformats.org/officeDocument/2006/customXml" ds:itemID="{F6194C16-5FE5-4670-BEC8-3D6DD9380312}">
+  <ds:schemaRefs>
+    <ds:schemaRef ds:uri="http://schemas.microsoft.com/sharepoint/v3/contenttype/forms"/>
+  </ds:schemaRefs>
+</ds:datastoreItem>
 </file>
</xml_diff>